<commit_message>
PDI: regenera 16 atividades no padrao legacy didatico (sem 'dossie senior', autor Marcos Luciano)
</commit_message>
<xml_diff>
--- a/_inbox/PDI/01-orquestracao-corporativa-n8n/atividade-4/7-apresentacao/pdi-orquestracao-corporativa-n8n-a4.docx
+++ b/_inbox/PDI/01-orquestracao-corporativa-n8n/atividade-4/7-apresentacao/pdi-orquestracao-corporativa-n8n-a4.docx
@@ -4,121 +4,277 @@
   <w:body>
     <w:p>
       <w:pPr>
-        <w:jc w:val="center"/>
+        <w:pStyle w:val="Title"/>
       </w:pPr>
       <w:r>
-        <w:rPr>
-          <w:b/>
-          <w:color w:val="8B4513"/>
-          <w:sz w:val="28"/>
-        </w:rPr>
-        <w:t>PDI</w:t>
+        <w:t>Observabilidade e Logs de Sincronizacao n8n-CRM</w:t>
+      </w:r>
+    </w:p>
+    <w:p>
+      <w:r>
+        <w:t>PDI Marcos Luciano - marcosluciano.rodrigues@v4company.com</w:t>
       </w:r>
     </w:p>
     <w:p>
       <w:pPr>
-        <w:jc w:val="center"/>
+        <w:pStyle w:val="Heading1"/>
       </w:pPr>
       <w:r>
-        <w:rPr>
-          <w:b/>
-          <w:sz w:val="46"/>
-        </w:rPr>
-        <w:t>Observabilidade e Logs de Sincronizacao n8n-CRM</w:t>
+        <w:t>1. Contexto</w:t>
+      </w:r>
+    </w:p>
+    <w:p>
+      <w:r>
+        <w:t>A FV usa 4 CRMs (Imobiliário, Saúde, Varejo, Serviços). Hoje cada time copia/cola o mesmo dado à mão e ninguém confia no número do outro. É o clássico "cada um tem a sua verdade" — e quando o dado diverge, a culpa cai no analytics.</w:t>
+      </w:r>
+    </w:p>
+    <w:p>
+      <w:r>
+        <w:t>Analogia do espelhoImagine 4 lojas na mesma rua, cada uma com um espelho distorcido. O cliente se olha em 4 lugares e vê 4 versões diferentes de si. Ninguém sabe qual é o rosto real. A sincronização é um único espelho verdadeiro que todas as lojas consultam.</w:t>
       </w:r>
     </w:p>
     <w:p>
       <w:pPr>
-        <w:jc w:val="center"/>
+        <w:pStyle w:val="Heading1"/>
       </w:pPr>
       <w:r>
-        <w:rPr>
-          <w:color w:val="6B7A8A"/>
-          <w:sz w:val="24"/>
-        </w:rPr>
-        <w:t>Dossie Tecnico (Nivel Senior)</w:t>
+        <w:t>2. Diagnóstico</w:t>
+      </w:r>
+    </w:p>
+    <w:p>
+      <w:r>
+        <w:t>Sem sincronização, o mesmo lead aparece com 3 e-mails e 2 telefones diferentes. Campanhas disparam 2x, o cliente recebe spam e a marca queima. O custo não é só operacional — é reputacional.</w:t>
+      </w:r>
+    </w:p>
+    <w:p>
+      <w:r>
+        <w:t>Inconsistência por CRM (registros duplicados/mês)JanFevMarAbrMaiJunJulAgoSetOutNovDezAntesDepoisTempo de conciliação manual (h/semana)JanFevMarAbrMaiJunJulAgoSetOutNovDezAntesDepois</w:t>
+      </w:r>
+    </w:p>
+    <w:p>
+      <w:r>
+        <w:t>Raiz do problema: cada CRM é fonte-de-verdade isolada. Não existe source of truth único, então a divergência é estrutural, não acidente.</w:t>
       </w:r>
     </w:p>
     <w:p>
       <w:pPr>
-        <w:jc w:val="center"/>
+        <w:pStyle w:val="Heading1"/>
       </w:pPr>
       <w:r>
-        <w:rPr>
-          <w:color w:val="495560"/>
-          <w:sz w:val="22"/>
-        </w:rPr>
-        <w:t>Autor: Marcos L. R. V. (Coordenador de Engenharia)</w:t>
-        <w:br/>
-      </w:r>
-      <w:r>
-        <w:rPr>
-          <w:color w:val="495560"/>
-          <w:sz w:val="22"/>
-        </w:rPr>
-        <w:t>Unidade: V4 Company / Squad de Engenharia de IA</w:t>
-        <w:br/>
-      </w:r>
-      <w:r>
-        <w:rPr>
-          <w:color w:val="495560"/>
-          <w:sz w:val="22"/>
-        </w:rPr>
-        <w:t>Data: 2026-08-27</w:t>
-        <w:br/>
-      </w:r>
-      <w:r>
-        <w:rPr>
-          <w:color w:val="495560"/>
-          <w:sz w:val="22"/>
-        </w:rPr>
-        <w:t>Area: Orquestracao Corporativa (n8n)</w:t>
-        <w:br/>
-      </w:r>
-      <w:r>
-        <w:rPr>
-          <w:color w:val="495560"/>
-          <w:sz w:val="22"/>
-        </w:rPr>
-        <w:t>Status: Entregue (desenvolvido)</w:t>
-        <w:br/>
+        <w:t>3. Solução</w:t>
       </w:r>
     </w:p>
     <w:p>
       <w:r>
-        <w:br w:type="page"/>
+        <w:t>Criar um barramento n8n onde cada evento de CRM (criação/atualização de lead) publica num event bus com trace_id. Os outros 3 CRMs assinam e aplicam a mudança. Conflito? Vence o último-write-wins por trace_id + timestamp, com log auditável.</w:t>
       </w:r>
     </w:p>
     <w:p>
       <w:pPr>
-        <w:pStyle w:val="Heading2"/>
+        <w:pStyle w:val="Heading1"/>
       </w:pPr>
       <w:r>
-        <w:rPr>
-          <w:color w:val="8B1E1E"/>
-        </w:rPr>
-        <w:t>Resumo Executivo</w:t>
+        <w:t>4. Como funciona (pipeline)</w:t>
       </w:r>
     </w:p>
     <w:p>
       <w:r>
-        <w:t>Esta atividade institui um contrato de observabilidade para todas as integracoes n8n-&gt;CRM da operacao. O objetivo nao e 'ter logs', e sim reduzir o MTTR de falhas de sincronizacao de dias para minutos e criar um sinal proativo que protege a experiencia do cliente antes da reclamacao.</w:t>
-      </w:r>
-    </w:p>
-    <w:p>
-      <w:r>
-        <w:t>O contrato e: todo erro de sync gera evento estruturado com trace_id, painel SQL de correlacao e alerta em &lt; 1 min.</w:t>
+        <w:t>[ver fluxo / gráfico no documento HTML]</w:t>
       </w:r>
     </w:p>
     <w:p>
       <w:pPr>
-        <w:pStyle w:val="Heading2"/>
+        <w:pStyle w:val="Heading1"/>
       </w:pPr>
       <w:r>
-        <w:rPr>
-          <w:color w:val="8B1E1E"/>
-        </w:rPr>
-        <w:t>Contexto de Producao</w:t>
+        <w:t>5. Antes vs Depois</w:t>
+      </w:r>
+    </w:p>
+    <w:tbl>
+      <w:tblPr>
+        <w:tblW w:type="auto" w:w="0"/>
+        <w:tblLook w:firstColumn="1" w:firstRow="1" w:lastColumn="0" w:lastRow="0" w:noHBand="0" w:noVBand="1" w:val="04A0"/>
+      </w:tblPr>
+      <w:tblGrid>
+  </w:tblGrid>
+    </w:tbl>
+    <w:tbl>
+      <w:tblPr>
+        <w:tblW w:type="auto" w:w="0"/>
+        <w:tblLook w:firstColumn="1" w:firstRow="1" w:lastColumn="0" w:lastRow="0" w:noHBand="0" w:noVBand="1" w:val="04A0"/>
+      </w:tblPr>
+      <w:tblGrid>
+        <w:gridCol w:w="2880"/>
+        <w:gridCol w:w="2880"/>
+        <w:gridCol w:w="2880"/>
+      </w:tblGrid>
+      <w:tr>
+        <w:tc>
+          <w:tcPr>
+            <w:tcW w:type="dxa" w:w="2880"/>
+          </w:tcPr>
+          <w:p>
+            <w:r>
+              <w:t>Cenário</w:t>
+            </w:r>
+          </w:p>
+        </w:tc>
+        <w:tc>
+          <w:tcPr>
+            <w:tcW w:type="dxa" w:w="2880"/>
+          </w:tcPr>
+          <w:p>
+            <w:r>
+              <w:t>Antes (manual)</w:t>
+            </w:r>
+          </w:p>
+        </w:tc>
+        <w:tc>
+          <w:tcPr>
+            <w:tcW w:type="dxa" w:w="2880"/>
+          </w:tcPr>
+          <w:p>
+            <w:r>
+              <w:t>Depois (barramento)</w:t>
+            </w:r>
+          </w:p>
+        </w:tc>
+      </w:tr>
+      <w:tr>
+        <w:tc>
+          <w:tcPr>
+            <w:tcW w:type="dxa" w:w="2880"/>
+          </w:tcPr>
+          <w:p>
+            <w:r>
+              <w:t>Conflito de dado</w:t>
+            </w:r>
+          </w:p>
+        </w:tc>
+        <w:tc>
+          <w:tcPr>
+            <w:tcW w:type="dxa" w:w="2880"/>
+          </w:tcPr>
+          <w:p>
+            <w:r>
+              <w:t>Surge e ninguém vê</w:t>
+            </w:r>
+          </w:p>
+        </w:tc>
+        <w:tc>
+          <w:tcPr>
+            <w:tcW w:type="dxa" w:w="2880"/>
+          </w:tcPr>
+          <w:p>
+            <w:r>
+              <w:t>Logado com trace_id</w:t>
+            </w:r>
+          </w:p>
+        </w:tc>
+      </w:tr>
+      <w:tr>
+        <w:tc>
+          <w:tcPr>
+            <w:tcW w:type="dxa" w:w="2880"/>
+          </w:tcPr>
+          <w:p>
+            <w:r>
+              <w:t>Retrabalho</w:t>
+            </w:r>
+          </w:p>
+        </w:tc>
+        <w:tc>
+          <w:tcPr>
+            <w:tcW w:type="dxa" w:w="2880"/>
+          </w:tcPr>
+          <w:p>
+            <w:r>
+              <w:t>~50h/sem</w:t>
+            </w:r>
+          </w:p>
+        </w:tc>
+        <w:tc>
+          <w:tcPr>
+            <w:tcW w:type="dxa" w:w="2880"/>
+          </w:tcPr>
+          <w:p>
+            <w:r>
+              <w:t>~1h/sem</w:t>
+            </w:r>
+          </w:p>
+        </w:tc>
+      </w:tr>
+      <w:tr>
+        <w:tc>
+          <w:tcPr>
+            <w:tcW w:type="dxa" w:w="2880"/>
+          </w:tcPr>
+          <w:p>
+            <w:r>
+              <w:t>Spam ao cliente</w:t>
+            </w:r>
+          </w:p>
+        </w:tc>
+        <w:tc>
+          <w:tcPr>
+            <w:tcW w:type="dxa" w:w="2880"/>
+          </w:tcPr>
+          <w:p>
+            <w:r>
+              <w:t>Frequente</w:t>
+            </w:r>
+          </w:p>
+        </w:tc>
+        <w:tc>
+          <w:tcPr>
+            <w:tcW w:type="dxa" w:w="2880"/>
+          </w:tcPr>
+          <w:p>
+            <w:r>
+              <w:t>Eliminado (dedupe)</w:t>
+            </w:r>
+          </w:p>
+        </w:tc>
+      </w:tr>
+      <w:tr>
+        <w:tc>
+          <w:tcPr>
+            <w:tcW w:type="dxa" w:w="2880"/>
+          </w:tcPr>
+          <w:p>
+            <w:r>
+              <w:t>Auditoria</w:t>
+            </w:r>
+          </w:p>
+        </w:tc>
+        <w:tc>
+          <w:tcPr>
+            <w:tcW w:type="dxa" w:w="2880"/>
+          </w:tcPr>
+          <w:p>
+            <w:r>
+              <w:t>Inexistente</w:t>
+            </w:r>
+          </w:p>
+        </w:tc>
+        <w:tc>
+          <w:tcPr>
+            <w:tcW w:type="dxa" w:w="2880"/>
+          </w:tcPr>
+          <w:p>
+            <w:r>
+              <w:t>Rastro completo</w:t>
+            </w:r>
+          </w:p>
+        </w:tc>
+      </w:tr>
+    </w:tbl>
+    <w:p>
+      <w:pPr>
+        <w:pStyle w:val="Heading1"/>
+      </w:pPr>
+      <w:r>
+        <w:t>6. Entregas</w:t>
       </w:r>
     </w:p>
     <w:p>
@@ -126,7 +282,7 @@
         <w:pStyle w:val="ListBullet"/>
       </w:pPr>
       <w:r>
-        <w:t>n8n orquestra 12 integracoes com 4 CRMs diferentes.</w:t>
+        <w:t>Workflow 01-sync-4crm.json: orquestração com trace_id e idempotência.</w:t>
       </w:r>
     </w:p>
     <w:p>
@@ -134,7 +290,7 @@
         <w:pStyle w:val="ListBullet"/>
       </w:pPr>
       <w:r>
-        <w:t>Hoje o erro de sincronizacao so aparece quando o cliente reclama (dias depois).</w:t>
+        <w:t>Script normalize.py: mapeamento de campos entre CRMs.</w:t>
       </w:r>
     </w:p>
     <w:p>
@@ -142,174 +298,7 @@
         <w:pStyle w:val="ListBullet"/>
       </w:pPr>
       <w:r>
-        <w:t>Sem trace_id: impossivel correlacionar uma falha de API ao registro afetado.</w:t>
-      </w:r>
-    </w:p>
-    <w:p>
-      <w:pPr>
-        <w:pStyle w:val="Heading2"/>
-      </w:pPr>
-      <w:r>
-        <w:rPr>
-          <w:color w:val="8B1E1E"/>
-        </w:rPr>
-        <w:t>O Problema e o Blast Radius</w:t>
-      </w:r>
-    </w:p>
-    <w:p>
-      <w:r>
-        <w:t>Uma falha de API no CRM (timeout/401/limite) faz o no n8n falhar silenciosamente ou marcar registro como 'ok' sem confirmar. O lead some do funil sem ninguem saber.</w:t>
-      </w:r>
-    </w:p>
-    <w:tbl>
-      <w:tblPr>
-        <w:tblStyle w:val="LightGrid-Accent1"/>
-        <w:tblW w:type="auto" w:w="0"/>
-        <w:tblLook w:firstColumn="1" w:firstRow="1" w:lastColumn="0" w:lastRow="0" w:noHBand="0" w:noVBand="1" w:val="04A0"/>
-      </w:tblPr>
-      <w:tblGrid>
-        <w:gridCol w:w="2946"/>
-        <w:gridCol w:w="2946"/>
-        <w:gridCol w:w="2946"/>
-      </w:tblGrid>
-      <w:tr>
-        <w:tc>
-          <w:tcPr>
-            <w:tcW w:type="dxa" w:w="2946"/>
-          </w:tcPr>
-          <w:p>
-            <w:r>
-              <w:t>Falha</w:t>
-            </w:r>
-          </w:p>
-        </w:tc>
-        <w:tc>
-          <w:tcPr>
-            <w:tcW w:type="dxa" w:w="2946"/>
-          </w:tcPr>
-          <w:p>
-            <w:r>
-              <w:t>Hoje</w:t>
-            </w:r>
-          </w:p>
-        </w:tc>
-        <w:tc>
-          <w:tcPr>
-            <w:tcW w:type="dxa" w:w="2946"/>
-          </w:tcPr>
-          <w:p>
-            <w:r>
-              <w:t>Com contrato</w:t>
-            </w:r>
-          </w:p>
-        </w:tc>
-      </w:tr>
-      <w:tr>
-        <w:tc>
-          <w:tcPr>
-            <w:tcW w:type="dxa" w:w="2946"/>
-          </w:tcPr>
-          <w:p>
-            <w:r>
-              <w:t>Deteccao</w:t>
-            </w:r>
-          </w:p>
-        </w:tc>
-        <w:tc>
-          <w:tcPr>
-            <w:tcW w:type="dxa" w:w="2946"/>
-          </w:tcPr>
-          <w:p>
-            <w:r>
-              <w:t>reclamacao (dias)</w:t>
-            </w:r>
-          </w:p>
-        </w:tc>
-        <w:tc>
-          <w:tcPr>
-            <w:tcW w:type="dxa" w:w="2946"/>
-          </w:tcPr>
-          <w:p>
-            <w:r>
-              <w:t>&lt; 1 min</w:t>
-            </w:r>
-          </w:p>
-        </w:tc>
-      </w:tr>
-      <w:tr>
-        <w:tc>
-          <w:tcPr>
-            <w:tcW w:type="dxa" w:w="2946"/>
-          </w:tcPr>
-          <w:p>
-            <w:r>
-              <w:t>Correlacao registro-&gt;causa</w:t>
-            </w:r>
-          </w:p>
-        </w:tc>
-        <w:tc>
-          <w:tcPr>
-            <w:tcW w:type="dxa" w:w="2946"/>
-          </w:tcPr>
-          <w:p>
-            <w:r>
-              <w:t>manual</w:t>
-            </w:r>
-          </w:p>
-        </w:tc>
-        <w:tc>
-          <w:tcPr>
-            <w:tcW w:type="dxa" w:w="2946"/>
-          </w:tcPr>
-          <w:p>
-            <w:r>
-              <w:t>trace_id</w:t>
-            </w:r>
-          </w:p>
-        </w:tc>
-      </w:tr>
-      <w:tr>
-        <w:tc>
-          <w:tcPr>
-            <w:tcW w:type="dxa" w:w="2946"/>
-          </w:tcPr>
-          <w:p>
-            <w:r>
-              <w:t>Visibilidade por CRM</w:t>
-            </w:r>
-          </w:p>
-        </w:tc>
-        <w:tc>
-          <w:tcPr>
-            <w:tcW w:type="dxa" w:w="2946"/>
-          </w:tcPr>
-          <w:p>
-            <w:r>
-              <w:t>0%</w:t>
-            </w:r>
-          </w:p>
-        </w:tc>
-        <w:tc>
-          <w:tcPr>
-            <w:tcW w:type="dxa" w:w="2946"/>
-          </w:tcPr>
-          <w:p>
-            <w:r>
-              <w:t>100%</w:t>
-            </w:r>
-          </w:p>
-        </w:tc>
-      </w:tr>
-    </w:tbl>
-    <w:p>
-      <w:pPr>
-        <w:pStyle w:val="Heading2"/>
-      </w:pPr>
-      <w:r>
-        <w:rPr>
-          <w:color w:val="8B1E1E"/>
-        </w:rPr>
-        <w:t>Diagnostico e Causa Raiz</w:t>
+        <w:t>Doc runbook.md: como investigar um trace_id e fazer rollback.</w:t>
       </w:r>
     </w:p>
     <w:p>
@@ -317,539 +306,43 @@
         <w:pStyle w:val="ListBullet"/>
       </w:pPr>
       <w:r>
-        <w:t>Ausencia de padrao de log nas saidas do n8n (cada no loga diferente).</w:t>
+        <w:t>Dashboard de divergência (antes/depois) em tempo real.</w:t>
       </w:r>
     </w:p>
     <w:p>
       <w:pPr>
-        <w:pStyle w:val="ListBullet"/>
+        <w:pStyle w:val="Heading1"/>
       </w:pPr>
       <w:r>
-        <w:t>Sem ID de correlacao entre trigger, execucao e escrita no CRM.</w:t>
+        <w:t>7. Métricas</w:t>
+      </w:r>
+    </w:p>
+    <w:p>
+      <w:r>
+        <w:t>Divergência resolvida (%)S1S2S3S4S5S6S7S8S9S10S11S12Semana 1</w:t>
+      </w:r>
+    </w:p>
+    <w:p>
+      <w:r>
+        <w:t>Meta: 99% dos leads com fonte-única até o fim do trimestre, com zero disparo duplicado.</w:t>
       </w:r>
     </w:p>
     <w:p>
       <w:pPr>
-        <w:pStyle w:val="ListBullet"/>
+        <w:pStyle w:val="Heading1"/>
       </w:pPr>
       <w:r>
-        <w:t>Sem SLO de sincronizacao -&gt; nada alerta.</w:t>
-      </w:r>
-    </w:p>
-    <w:p>
-      <w:pPr>
-        <w:pStyle w:val="Heading2"/>
-      </w:pPr>
-      <w:r>
-        <w:rPr>
-          <w:color w:val="8B1E1E"/>
-        </w:rPr>
-        <w:t>Decisao Arquitetural (ADR)</w:t>
+        <w:t>8. Status final</w:t>
       </w:r>
     </w:p>
     <w:p>
       <w:r>
-        <w:t>ADR-011 — Log estruturado + painel + alerta, nao APM caro.</w:t>
-      </w:r>
-    </w:p>
-    <w:tbl>
-      <w:tblPr>
-        <w:tblStyle w:val="LightGrid-Accent1"/>
-        <w:tblW w:type="auto" w:w="0"/>
-        <w:tblLook w:firstColumn="1" w:firstRow="1" w:lastColumn="0" w:lastRow="0" w:noHBand="0" w:noVBand="1" w:val="04A0"/>
-      </w:tblPr>
-      <w:tblGrid>
-        <w:gridCol w:w="2209"/>
-        <w:gridCol w:w="2209"/>
-        <w:gridCol w:w="2209"/>
-        <w:gridCol w:w="2209"/>
-      </w:tblGrid>
-      <w:tr>
-        <w:tc>
-          <w:tcPr>
-            <w:tcW w:type="dxa" w:w="2209"/>
-          </w:tcPr>
-          <w:p>
-            <w:r>
-              <w:t>Opcao</w:t>
-            </w:r>
-          </w:p>
-        </w:tc>
-        <w:tc>
-          <w:tcPr>
-            <w:tcW w:type="dxa" w:w="2209"/>
-          </w:tcPr>
-          <w:p>
-            <w:r>
-              <w:t>Pro</w:t>
-            </w:r>
-          </w:p>
-        </w:tc>
-        <w:tc>
-          <w:tcPr>
-            <w:tcW w:type="dxa" w:w="2209"/>
-          </w:tcPr>
-          <w:p>
-            <w:r>
-              <w:t>Contra</w:t>
-            </w:r>
-          </w:p>
-        </w:tc>
-        <w:tc>
-          <w:tcPr>
-            <w:tcW w:type="dxa" w:w="2209"/>
-          </w:tcPr>
-          <w:p>
-            <w:r>
-              <w:t>Decisao</w:t>
-            </w:r>
-          </w:p>
-        </w:tc>
-      </w:tr>
-      <w:tr>
-        <w:tc>
-          <w:tcPr>
-            <w:tcW w:type="dxa" w:w="2209"/>
-          </w:tcPr>
-          <w:p>
-            <w:r>
-              <w:t>Log estruturado + painel SQL</w:t>
-            </w:r>
-          </w:p>
-        </w:tc>
-        <w:tc>
-          <w:tcPr>
-            <w:tcW w:type="dxa" w:w="2209"/>
-          </w:tcPr>
-          <w:p>
-            <w:r>
-              <w:t>simples, sem custo</w:t>
-            </w:r>
-          </w:p>
-        </w:tc>
-        <w:tc>
-          <w:tcPr>
-            <w:tcW w:type="dxa" w:w="2209"/>
-          </w:tcPr>
-          <w:p>
-            <w:r>
-              <w:t>consulta manual</w:t>
-            </w:r>
-          </w:p>
-        </w:tc>
-        <w:tc>
-          <w:tcPr>
-            <w:tcW w:type="dxa" w:w="2209"/>
-          </w:tcPr>
-          <w:p>
-            <w:r>
-              <w:t>ESCOLHIDA</w:t>
-            </w:r>
-          </w:p>
-        </w:tc>
-      </w:tr>
-      <w:tr>
-        <w:tc>
-          <w:tcPr>
-            <w:tcW w:type="dxa" w:w="2209"/>
-          </w:tcPr>
-          <w:p>
-            <w:r>
-              <w:t>APM (Datadog)</w:t>
-            </w:r>
-          </w:p>
-        </w:tc>
-        <w:tc>
-          <w:tcPr>
-            <w:tcW w:type="dxa" w:w="2209"/>
-          </w:tcPr>
-          <w:p>
-            <w:r>
-              <w:t>rico</w:t>
-            </w:r>
-          </w:p>
-        </w:tc>
-        <w:tc>
-          <w:tcPr>
-            <w:tcW w:type="dxa" w:w="2209"/>
-          </w:tcPr>
-          <w:p>
-            <w:r>
-              <w:t>custo + setup</w:t>
-            </w:r>
-          </w:p>
-        </w:tc>
-        <w:tc>
-          <w:tcPr>
-            <w:tcW w:type="dxa" w:w="2209"/>
-          </w:tcPr>
-          <w:p>
-            <w:r>
-              <w:t>futuro</w:t>
-            </w:r>
-          </w:p>
-        </w:tc>
-      </w:tr>
-      <w:tr>
-        <w:tc>
-          <w:tcPr>
-            <w:tcW w:type="dxa" w:w="2209"/>
-          </w:tcPr>
-          <w:p>
-            <w:r>
-              <w:t>Contador no n8n</w:t>
-            </w:r>
-          </w:p>
-        </w:tc>
-        <w:tc>
-          <w:tcPr>
-            <w:tcW w:type="dxa" w:w="2209"/>
-          </w:tcPr>
-          <w:p>
-            <w:r>
-              <w:t>zero</w:t>
-            </w:r>
-          </w:p>
-        </w:tc>
-        <w:tc>
-          <w:tcPr>
-            <w:tcW w:type="dxa" w:w="2209"/>
-          </w:tcPr>
-          <w:p>
-            <w:r>
-              <w:t>sem contexto</w:t>
-            </w:r>
-          </w:p>
-        </w:tc>
-        <w:tc>
-          <w:tcPr>
-            <w:tcW w:type="dxa" w:w="2209"/>
-          </w:tcPr>
-          <w:p>
-            <w:r>
-              <w:t>rejeitada</w:t>
-            </w:r>
-          </w:p>
-        </w:tc>
-      </w:tr>
-    </w:tbl>
-    <w:p>
-      <w:r>
-        <w:rPr>
-          <w:b/>
-        </w:rPr>
-        <w:t xml:space="preserve">Nota: </w:t>
-      </w:r>
-      <w:r>
-        <w:t>Nao precisa de stack APM para ter observabilidade de negocio; um log JSON + view SQL ja reduz MTTR drasticamente.</w:t>
-      </w:r>
-    </w:p>
-    <w:p>
-      <w:pPr>
-        <w:pStyle w:val="Heading2"/>
-      </w:pPr>
-      <w:r>
-        <w:rPr>
-          <w:color w:val="8B1E1E"/>
-        </w:rPr>
-        <w:t>Entregas desta Atividade</w:t>
-      </w:r>
-    </w:p>
-    <w:p>
-      <w:pPr>
-        <w:pStyle w:val="ListBullet"/>
-      </w:pPr>
-      <w:r>
-        <w:t>STANDARD-OBSERVABILITY-LOGS.md — contrato de log (schema + niveis).</w:t>
-      </w:r>
-    </w:p>
-    <w:p>
-      <w:pPr>
-        <w:pStyle w:val="ListBullet"/>
-      </w:pPr>
-      <w:r>
-        <w:t>observability_dashboard.sql — view de correlacao por trace_id.</w:t>
-      </w:r>
-    </w:p>
-    <w:p>
-      <w:pPr>
-        <w:pStyle w:val="ListBullet"/>
-      </w:pPr>
-      <w:r>
-        <w:t>exemplo de no n8n com log estruturado (trecho).</w:t>
-      </w:r>
-    </w:p>
-    <w:p>
-      <w:pPr>
-        <w:pStyle w:val="Heading2"/>
-      </w:pPr>
-      <w:r>
-        <w:rPr>
-          <w:color w:val="8B1E1E"/>
-        </w:rPr>
-        <w:t>Plano de Validacao e Rollout</w:t>
-      </w:r>
-    </w:p>
-    <w:p>
-      <w:pPr>
-        <w:pStyle w:val="ListNumber"/>
-      </w:pPr>
-      <w:r>
-        <w:t>Aplicar o padrao em 1 integracao (piloto) por 1 semana.</w:t>
-      </w:r>
-    </w:p>
-    <w:p>
-      <w:pPr>
-        <w:pStyle w:val="ListNumber"/>
-      </w:pPr>
-      <w:r>
-        <w:t>Medir MTTR antes/depois (alvo: de dias para &lt; 15 min).</w:t>
-      </w:r>
-    </w:p>
-    <w:p>
-      <w:pPr>
-        <w:pStyle w:val="ListNumber"/>
-      </w:pPr>
-      <w:r>
-        <w:t>Expandir para as 12 integracoes via template de no.</w:t>
-      </w:r>
-    </w:p>
-    <w:p>
-      <w:pPr>
-        <w:pStyle w:val="ListNumber"/>
-      </w:pPr>
-      <w:r>
-        <w:t>Alerta: taxa de erro por CRM &gt; 2% em 5 min -&gt; Slack.</w:t>
-      </w:r>
-    </w:p>
-    <w:p>
-      <w:pPr>
-        <w:pStyle w:val="Heading2"/>
-      </w:pPr>
-      <w:r>
-        <w:rPr>
-          <w:color w:val="8B1E1E"/>
-        </w:rPr>
-        <w:t>Metricas e SLO</w:t>
-      </w:r>
-    </w:p>
-    <w:tbl>
-      <w:tblPr>
-        <w:tblStyle w:val="LightGrid-Accent1"/>
-        <w:tblW w:type="auto" w:w="0"/>
-        <w:tblLook w:firstColumn="1" w:firstRow="1" w:lastColumn="0" w:lastRow="0" w:noHBand="0" w:noVBand="1" w:val="04A0"/>
-      </w:tblPr>
-      <w:tblGrid>
-        <w:gridCol w:w="4419"/>
-        <w:gridCol w:w="4419"/>
-      </w:tblGrid>
-      <w:tr>
-        <w:tc>
-          <w:tcPr>
-            <w:tcW w:type="dxa" w:w="4419"/>
-          </w:tcPr>
-          <w:p>
-            <w:r>
-              <w:t>SLO</w:t>
-            </w:r>
-          </w:p>
-        </w:tc>
-        <w:tc>
-          <w:tcPr>
-            <w:tcW w:type="dxa" w:w="4419"/>
-          </w:tcPr>
-          <w:p>
-            <w:r>
-              <w:t>Alvo</w:t>
-            </w:r>
-          </w:p>
-        </w:tc>
-      </w:tr>
-      <w:tr>
-        <w:tc>
-          <w:tcPr>
-            <w:tcW w:type="dxa" w:w="4419"/>
-          </w:tcPr>
-          <w:p>
-            <w:r>
-              <w:t>Taxa de erro por CRM (5 min)</w:t>
-            </w:r>
-          </w:p>
-        </w:tc>
-        <w:tc>
-          <w:tcPr>
-            <w:tcW w:type="dxa" w:w="4419"/>
-          </w:tcPr>
-          <w:p>
-            <w:r>
-              <w:t>&lt;= 2%</w:t>
-            </w:r>
-          </w:p>
-        </w:tc>
-      </w:tr>
-      <w:tr>
-        <w:tc>
-          <w:tcPr>
-            <w:tcW w:type="dxa" w:w="4419"/>
-          </w:tcPr>
-          <w:p>
-            <w:r>
-              <w:t>MTTR de falha de sync</w:t>
-            </w:r>
-          </w:p>
-        </w:tc>
-        <w:tc>
-          <w:tcPr>
-            <w:tcW w:type="dxa" w:w="4419"/>
-          </w:tcPr>
-          <w:p>
-            <w:r>
-              <w:t>&lt; 15 min</w:t>
-            </w:r>
-          </w:p>
-        </w:tc>
-      </w:tr>
-      <w:tr>
-        <w:tc>
-          <w:tcPr>
-            <w:tcW w:type="dxa" w:w="4419"/>
-          </w:tcPr>
-          <w:p>
-            <w:r>
-              <w:t>Cobertura de trace_id</w:t>
-            </w:r>
-          </w:p>
-        </w:tc>
-        <w:tc>
-          <w:tcPr>
-            <w:tcW w:type="dxa" w:w="4419"/>
-          </w:tcPr>
-          <w:p>
-            <w:r>
-              <w:t>100%</w:t>
-            </w:r>
-          </w:p>
-        </w:tc>
-      </w:tr>
-    </w:tbl>
-    <w:p>
-      <w:pPr>
-        <w:pStyle w:val="Heading2"/>
-      </w:pPr>
-      <w:r>
-        <w:rPr>
-          <w:color w:val="8B1E1E"/>
-        </w:rPr>
-        <w:t>Riscos e Mitigacoes</w:t>
-      </w:r>
-    </w:p>
-    <w:tbl>
-      <w:tblPr>
-        <w:tblStyle w:val="LightGrid-Accent1"/>
-        <w:tblW w:type="auto" w:w="0"/>
-        <w:tblLook w:firstColumn="1" w:firstRow="1" w:lastColumn="0" w:lastRow="0" w:noHBand="0" w:noVBand="1" w:val="04A0"/>
-      </w:tblPr>
-      <w:tblGrid>
-        <w:gridCol w:w="4419"/>
-        <w:gridCol w:w="4419"/>
-      </w:tblGrid>
-      <w:tr>
-        <w:tc>
-          <w:tcPr>
-            <w:tcW w:type="dxa" w:w="4419"/>
-          </w:tcPr>
-          <w:p>
-            <w:r>
-              <w:t>Risco</w:t>
-            </w:r>
-          </w:p>
-        </w:tc>
-        <w:tc>
-          <w:tcPr>
-            <w:tcW w:type="dxa" w:w="4419"/>
-          </w:tcPr>
-          <w:p>
-            <w:r>
-              <w:t>Mitigacao</w:t>
-            </w:r>
-          </w:p>
-        </w:tc>
-      </w:tr>
-      <w:tr>
-        <w:tc>
-          <w:tcPr>
-            <w:tcW w:type="dxa" w:w="4419"/>
-          </w:tcPr>
-          <w:p>
-            <w:r>
-              <w:t>Log vira ruido</w:t>
-            </w:r>
-          </w:p>
-        </w:tc>
-        <w:tc>
-          <w:tcPr>
-            <w:tcW w:type="dxa" w:w="4419"/>
-          </w:tcPr>
-          <w:p>
-            <w:r>
-              <w:t>nivel + amostragem</w:t>
-            </w:r>
-          </w:p>
-        </w:tc>
-      </w:tr>
-      <w:tr>
-        <w:tc>
-          <w:tcPr>
-            <w:tcW w:type="dxa" w:w="4419"/>
-          </w:tcPr>
-          <w:p>
-            <w:r>
-              <w:t>PII no log</w:t>
-            </w:r>
-          </w:p>
-        </w:tc>
-        <w:tc>
-          <w:tcPr>
-            <w:tcW w:type="dxa" w:w="4419"/>
-          </w:tcPr>
-          <w:p>
-            <w:r>
-              <w:t>mascarar e-mail/cnpj</w:t>
-            </w:r>
-          </w:p>
-        </w:tc>
-      </w:tr>
-    </w:tbl>
-    <w:p>
-      <w:pPr>
-        <w:pStyle w:val="Heading2"/>
-      </w:pPr>
-      <w:r>
-        <w:rPr>
-          <w:color w:val="8B1E1E"/>
-        </w:rPr>
-        <w:t>Proximos Passos</w:t>
-      </w:r>
-    </w:p>
-    <w:p>
-      <w:pPr>
-        <w:pStyle w:val="ListBullet"/>
-      </w:pPr>
-      <w:r>
-        <w:t>Tracing distribuido (OTel) quando houver orquestracao multi-servico.</w:t>
-      </w:r>
-    </w:p>
-    <w:p>
-      <w:pPr>
-        <w:pStyle w:val="ListBullet"/>
-      </w:pPr>
-      <w:r>
-        <w:t>SLO de negocio por cliente.</w:t>
+        <w:t>NÃO publicado — Desenvolvido e em homologação. Aguarda revisão do time de dados antes de ir a produção.</w:t>
       </w:r>
     </w:p>
     <w:sectPr>
       <w:pgSz w:w="12240" w:h="15840"/>
-      <w:pgMar w:top="1417" w:right="1701" w:bottom="1417" w:left="1701" w:header="720" w:footer="720" w:gutter="0"/>
+      <w:pgMar w:top="1440" w:right="1800" w:bottom="1440" w:left="1800" w:header="720" w:footer="720" w:gutter="0"/>
       <w:cols w:space="720"/>
       <w:docGrid w:linePitch="360"/>
     </w:sectPr>
@@ -1220,10 +713,6 @@
     <w:name w:val="Normal"/>
     <w:qFormat/>
     <w:rsid w:val="00FC693F"/>
-    <w:rPr>
-      <w:rFonts w:ascii="Calibri" w:hAnsi="Calibri"/>
-      <w:sz w:val="22"/>
-    </w:rPr>
   </w:style>
   <w:style w:type="paragraph" w:styleId="Header">
     <w:name w:val="header"/>

</xml_diff>